<commit_message>
Update report and script to include GitHub repo link
</commit_message>
<xml_diff>
--- a/Yonetici_Ozeti_Raporu.docx
+++ b/Yonetici_Ozeti_Raporu.docx
@@ -20,7 +20,7 @@
     </w:p>
     <w:p>
       <w:pPr>
-        <w:spacing w:after="280"/>
+        <w:spacing w:after="120"/>
         <w:jc w:val="center"/>
       </w:pPr>
       <w:r>
@@ -30,6 +30,19 @@
           <w:sz w:val="23"/>
         </w:rPr>
         <w:t>Yönetici Özeti Raporu — YBS Python ile Veri Bilimi Dönem Sonu Projesi</w:t>
+      </w:r>
+    </w:p>
+    <w:p>
+      <w:pPr>
+        <w:spacing w:after="280"/>
+        <w:jc w:val="center"/>
+      </w:pPr>
+      <w:r>
+        <w:rPr>
+          <w:color w:val="555555"/>
+          <w:sz w:val="19"/>
+        </w:rPr>
+        <w:t>GitHub Deposu: https://github.com/elifaydnlll/amazon-kablosuz-kulaklik-urunlerinde-aciklanabilir-urun-analitigi/tree/main</w:t>
       </w:r>
     </w:p>
     <w:p>

</xml_diff>

<commit_message>
Add GitHub repo link to the end of Word and PDF reports
</commit_message>
<xml_diff>
--- a/Yonetici_Ozeti_Raporu.docx
+++ b/Yonetici_Ozeti_Raporu.docx
@@ -1142,6 +1142,45 @@
         <w:t>Gelecek çalışmalarda, ek metin madenciliği teknikleri (konu modelleme, BERT tabanlı duygu analizi) ile ComplaintCategory sınıflandırmasının doğruluğu artırılabilir.</w:t>
       </w:r>
     </w:p>
+    <w:p>
+      <w:pPr>
+        <w:spacing w:after="120"/>
+      </w:pPr>
+      <w:r>
+        <w:rPr>
+          <w:b w:val="0"/>
+          <w:i w:val="0"/>
+          <w:sz w:val="21"/>
+        </w:rPr>
+      </w:r>
+    </w:p>
+    <w:p>
+      <w:pPr>
+        <w:spacing w:after="120"/>
+      </w:pPr>
+      <w:r>
+        <w:rPr>
+          <w:b/>
+          <w:i w:val="0"/>
+          <w:color w:val="1F355E"/>
+          <w:sz w:val="22"/>
+        </w:rPr>
+        <w:t>Proje GitHub Deposu:</w:t>
+      </w:r>
+    </w:p>
+    <w:p>
+      <w:pPr>
+        <w:spacing w:after="120"/>
+      </w:pPr>
+      <w:r>
+        <w:rPr>
+          <w:b w:val="0"/>
+          <w:i/>
+          <w:sz w:val="20"/>
+        </w:rPr>
+        <w:t>https://github.com/elifaydnlll/amazon-kablosuz-kulaklik-urunlerinde-aciklanabilir-urun-analitigi/tree/main</w:t>
+      </w:r>
+    </w:p>
     <w:sectPr>
       <w:pgSz w:w="12240" w:h="15840"/>
       <w:pgMar w:top="907" w:right="1020" w:bottom="907" w:left="1020" w:header="720" w:footer="720" w:gutter="0"/>

</xml_diff>